<commit_message>
Add report evidence and reproducibility files
</commit_message>
<xml_diff>
--- a/논문 진짜 작성하는 곳.docx
+++ b/논문 진짜 작성하는 곳.docx
@@ -41,7 +41,7 @@
           <w:b w:val="0"/>
           <w:sz w:val="20"/>
         </w:rPr>
-        <w:t>Gil Dong Hong1, Author Name2, Author Name3</w:t>
+        <w:t>Software Security Research Team</w:t>
       </w:r>
     </w:p>
     <w:p>
@@ -55,7 +55,7 @@
           <w:b w:val="0"/>
           <w:sz w:val="20"/>
         </w:rPr>
-        <w:t>홍길동1, 저자이름2, 저자이름3</w:t>
+        <w:t>소프트웨어 개발보안 연구팀</w:t>
       </w:r>
     </w:p>
     <w:p>
@@ -69,7 +69,7 @@
           <w:b w:val="0"/>
           <w:sz w:val="20"/>
         </w:rPr>
-        <w:t>1 소속학과, 대학교, 국가, E-mail</w:t>
+        <w:t>소프트웨어 개발보안 수업 연구팀, Korea</w:t>
       </w:r>
     </w:p>
     <w:p>
@@ -1496,6 +1496,19 @@
     <w:p>
       <w:pPr>
         <w:spacing w:after="60" w:line="240" w:lineRule="auto"/>
+      </w:pPr>
+      <w:r>
+        <w:rPr>
+          <w:rFonts w:ascii="Times New Roman" w:hAnsi="Times New Roman" w:eastAsia="Batang"/>
+          <w:b w:val="0"/>
+          <w:sz w:val="22"/>
+        </w:rPr>
+        <w:t>팀 실습 기준 STRIDE 수동 분석은 DFD 작성, STRIDE 분류, DREAD 점수 산정을 포함해 약 60~90분 범위로 정리하였다. 본 비교 보고서의 분당 지표는 중앙값인 75분을 사용했으며, ZAP Baseline Scan은 Docker 실행 옵션 기준 5분으로 기록하였다.</w:t>
+      </w:r>
+    </w:p>
+    <w:p>
+      <w:pPr>
+        <w:spacing w:after="60" w:line="240" w:lineRule="auto"/>
         <w:jc w:val="center"/>
       </w:pPr>
       <w:r>
@@ -2229,6 +2242,92 @@
                 <w:sz w:val="18"/>
               </w:rPr>
               <w:t>점수 체계가 달라 직접 크기 비교보다 우선순위 참고용으로 사용함</w:t>
+            </w:r>
+          </w:p>
+        </w:tc>
+      </w:tr>
+      <w:tr>
+        <w:tc>
+          <w:tcPr>
+            <w:tcW w:type="dxa" w:w="2436"/>
+            <w:vAlign w:val="center"/>
+          </w:tcPr>
+          <w:p>
+            <w:pPr>
+              <w:spacing w:after="0"/>
+              <w:jc w:val="left"/>
+            </w:pPr>
+            <w:r/>
+            <w:r>
+              <w:rPr>
+                <w:rFonts w:ascii="Times New Roman" w:hAnsi="Times New Roman" w:eastAsia="Batang"/>
+                <w:b w:val="0"/>
+                <w:sz w:val="18"/>
+              </w:rPr>
+              <w:t>분석 소요시간</w:t>
+            </w:r>
+          </w:p>
+        </w:tc>
+        <w:tc>
+          <w:tcPr>
+            <w:tcW w:type="dxa" w:w="2436"/>
+            <w:vAlign w:val="center"/>
+          </w:tcPr>
+          <w:p>
+            <w:pPr>
+              <w:spacing w:after="0"/>
+              <w:jc w:val="center"/>
+            </w:pPr>
+            <w:r/>
+            <w:r>
+              <w:rPr>
+                <w:rFonts w:ascii="Times New Roman" w:hAnsi="Times New Roman" w:eastAsia="Batang"/>
+                <w:b w:val="0"/>
+                <w:sz w:val="18"/>
+              </w:rPr>
+              <w:t>60~90분, 지표 산정값 75분</w:t>
+            </w:r>
+          </w:p>
+        </w:tc>
+        <w:tc>
+          <w:tcPr>
+            <w:tcW w:type="dxa" w:w="2436"/>
+            <w:vAlign w:val="center"/>
+          </w:tcPr>
+          <w:p>
+            <w:pPr>
+              <w:spacing w:after="0"/>
+              <w:jc w:val="center"/>
+            </w:pPr>
+            <w:r/>
+            <w:r>
+              <w:rPr>
+                <w:rFonts w:ascii="Times New Roman" w:hAnsi="Times New Roman" w:eastAsia="Batang"/>
+                <w:b w:val="0"/>
+                <w:sz w:val="18"/>
+              </w:rPr>
+              <w:t>5분</w:t>
+            </w:r>
+          </w:p>
+        </w:tc>
+        <w:tc>
+          <w:tcPr>
+            <w:tcW w:type="dxa" w:w="2436"/>
+            <w:vAlign w:val="center"/>
+          </w:tcPr>
+          <w:p>
+            <w:pPr>
+              <w:spacing w:after="0"/>
+              <w:jc w:val="left"/>
+            </w:pPr>
+            <w:r/>
+            <w:r>
+              <w:rPr>
+                <w:rFonts w:ascii="Times New Roman" w:hAnsi="Times New Roman" w:eastAsia="Batang"/>
+                <w:b w:val="0"/>
+                <w:sz w:val="18"/>
+              </w:rPr>
+              <w:t>B안은 짧은 시간 안에 반복 측정이 가능함</w:t>
             </w:r>
           </w:p>
         </w:tc>
@@ -3678,7 +3777,7 @@
                 <w:b w:val="0"/>
                 <w:sz w:val="18"/>
               </w:rPr>
-              <w:t>ZAP only</w:t>
+              <w:t>Unmapped ZAP informational</w:t>
             </w:r>
           </w:p>
         </w:tc>
@@ -3694,6 +3793,19 @@
           <w:b w:val="0"/>
           <w:sz w:val="18"/>
         </w:rPr>
+      </w:r>
+    </w:p>
+    <w:p>
+      <w:pPr>
+        <w:spacing w:after="60" w:line="240" w:lineRule="auto"/>
+      </w:pPr>
+      <w:r>
+        <w:rPr>
+          <w:rFonts w:ascii="Times New Roman" w:hAnsi="Times New Roman" w:eastAsia="Batang"/>
+          <w:b w:val="0"/>
+          <w:sz w:val="22"/>
+        </w:rPr>
+        <w:t>ZAP 단독 OWASP Top 10 카테고리는 없었으나, OWASP Top 10에 직접 매핑되지 않는 정보성 경고 1건이 존재하였다. 따라서 본 연구에서는 해당 항목을 별도 오탐 후보로 분리하고, ZAP의 단독 Top 10 탐지 범위에는 포함하지 않았다.</w:t>
       </w:r>
     </w:p>
     <w:p>

</xml_diff>

<commit_message>
Add Mediasoup n8n security automation extension
</commit_message>
<xml_diff>
--- a/논문 진짜 작성하는 곳.docx
+++ b/논문 진짜 작성하는 곳.docx
@@ -3051,63 +3051,6 @@
           <w:lang w:eastAsia="ko-KR"/>
         </w:rPr>
         <w:t>, OWASP Top 10, WebRTC</w:t>
-      </w:r>
-    </w:p>
-    <w:p>
-      <w:pPr>
-        <w:spacing w:after="60"/>
-        <w:rPr>
-          <w:bCs/>
-          <w:lang w:eastAsia="ko-KR"/>
-        </w:rPr>
-      </w:pPr>
-      <w:r>
-        <w:rPr>
-          <w:rFonts w:hint="eastAsia"/>
-          <w:b/>
-          <w:lang w:eastAsia="ko-KR"/>
-        </w:rPr>
-        <w:t>핵심어</w:t>
-      </w:r>
-      <w:r>
-        <w:rPr>
-          <w:rFonts w:hint="eastAsia"/>
-          <w:bCs/>
-          <w:lang w:eastAsia="ko-KR"/>
-        </w:rPr>
-        <w:t xml:space="preserve">: </w:t>
-      </w:r>
-      <w:r>
-        <w:rPr>
-          <w:rFonts w:hint="eastAsia"/>
-          <w:bCs/>
-          <w:lang w:eastAsia="ko-KR"/>
-        </w:rPr>
-        <w:t>4</w:t>
-      </w:r>
-      <w:r>
-        <w:rPr>
-          <w:rFonts w:hint="eastAsia"/>
-          <w:bCs/>
-          <w:lang w:eastAsia="ko-KR"/>
-        </w:rPr>
-        <w:t>개</w:t>
-      </w:r>
-      <w:r>
-        <w:rPr>
-          <w:rFonts w:hint="eastAsia"/>
-          <w:bCs/>
-          <w:lang w:eastAsia="ko-KR"/>
-        </w:rPr>
-        <w:t xml:space="preserve"> </w:t>
-      </w:r>
-      <w:r>
-        <w:rPr>
-          <w:rFonts w:hint="eastAsia"/>
-          <w:bCs/>
-          <w:lang w:eastAsia="ko-KR"/>
-        </w:rPr>
-        <w:t>이상</w:t>
       </w:r>
     </w:p>
     <w:p>
@@ -10613,6 +10556,62 @@
     </w:p>
     <w:p>
       <w:pPr>
+        <w:keepNext/>
+        <w:spacing w:before="120" w:after="40"/>
+        <w:jc w:val="center"/>
+      </w:pPr>
+      <w:r>
+        <w:rPr>
+          <w:rFonts w:ascii="Times New Roman" w:hAnsi="Times New Roman" w:eastAsia="Batang"/>
+          <w:b/>
+          <w:sz w:val="18"/>
+        </w:rPr>
+        <w:t>[그림 1] OWASP Top 10 탐지 커버리지 비교</w:t>
+      </w:r>
+    </w:p>
+    <w:p>
+      <w:pPr>
+        <w:keepLines/>
+        <w:spacing w:before="0" w:after="120"/>
+        <w:jc w:val="center"/>
+      </w:pPr>
+      <w:r>
+        <w:drawing>
+          <wp:inline xmlns:a="http://schemas.openxmlformats.org/drawingml/2006/main" xmlns:pic="http://schemas.openxmlformats.org/drawingml/2006/picture">
+            <wp:extent cx="4937760" cy="2790908"/>
+            <wp:docPr id="1" name="Picture 1" title="[그림 1] OWASP Top 10 탐지 커버리지 비교" descr="STRIDE, ZAP, combined OWASP Top 10 detection coverage bar chart"/>
+            <wp:cNvGraphicFramePr>
+              <a:graphicFrameLocks noChangeAspect="1"/>
+            </wp:cNvGraphicFramePr>
+            <a:graphic>
+              <a:graphicData uri="http://schemas.openxmlformats.org/drawingml/2006/picture">
+                <pic:pic>
+                  <pic:nvPicPr>
+                    <pic:cNvPr id="0" name="image.png"/>
+                    <pic:cNvPicPr/>
+                  </pic:nvPicPr>
+                  <pic:blipFill>
+                    <a:blip r:embed="rId22"/>
+                    <a:stretch>
+                      <a:fillRect/>
+                    </a:stretch>
+                  </pic:blipFill>
+                  <pic:spPr>
+                    <a:xfrm>
+                      <a:off x="0" y="0"/>
+                      <a:ext cx="4937760" cy="2790908"/>
+                    </a:xfrm>
+                    <a:prstGeom prst="rect"/>
+                  </pic:spPr>
+                </pic:pic>
+              </a:graphicData>
+            </a:graphic>
+          </wp:inline>
+        </w:drawing>
+      </w:r>
+    </w:p>
+    <w:p>
+      <w:pPr>
         <w:spacing w:after="60"/>
         <w:rPr>
           <w:lang w:eastAsia="ko-KR"/>
@@ -11157,6 +11156,62 @@
           <w:lang w:eastAsia="ko-KR"/>
         </w:rPr>
         <w:t>.</w:t>
+      </w:r>
+    </w:p>
+    <w:p>
+      <w:pPr>
+        <w:keepNext/>
+        <w:spacing w:before="120" w:after="40"/>
+        <w:jc w:val="center"/>
+      </w:pPr>
+      <w:r>
+        <w:rPr>
+          <w:rFonts w:ascii="Times New Roman" w:hAnsi="Times New Roman" w:eastAsia="Batang"/>
+          <w:b/>
+          <w:sz w:val="18"/>
+        </w:rPr>
+        <w:t>[그림 2] 보안 헤더 적용 전후 ZAP 경고 변화</w:t>
+      </w:r>
+    </w:p>
+    <w:p>
+      <w:pPr>
+        <w:keepLines/>
+        <w:spacing w:before="0" w:after="120"/>
+        <w:jc w:val="center"/>
+      </w:pPr>
+      <w:r>
+        <w:drawing>
+          <wp:inline xmlns:a="http://schemas.openxmlformats.org/drawingml/2006/main" xmlns:pic="http://schemas.openxmlformats.org/drawingml/2006/picture">
+            <wp:extent cx="4937760" cy="2790908"/>
+            <wp:docPr id="2" name="Picture 2" title="[그림 2] 보안 헤더 적용 전후 ZAP 경고 변화" descr="ZAP alert and instance count reduction before and after security headers"/>
+            <wp:cNvGraphicFramePr>
+              <a:graphicFrameLocks noChangeAspect="1"/>
+            </wp:cNvGraphicFramePr>
+            <a:graphic>
+              <a:graphicData uri="http://schemas.openxmlformats.org/drawingml/2006/picture">
+                <pic:pic>
+                  <pic:nvPicPr>
+                    <pic:cNvPr id="0" name="image.png"/>
+                    <pic:cNvPicPr/>
+                  </pic:nvPicPr>
+                  <pic:blipFill>
+                    <a:blip r:embed="rId23"/>
+                    <a:stretch>
+                      <a:fillRect/>
+                    </a:stretch>
+                  </pic:blipFill>
+                  <pic:spPr>
+                    <a:xfrm>
+                      <a:off x="0" y="0"/>
+                      <a:ext cx="4937760" cy="2790908"/>
+                    </a:xfrm>
+                    <a:prstGeom prst="rect"/>
+                  </pic:spPr>
+                </pic:pic>
+              </a:graphicData>
+            </a:graphic>
+          </wp:inline>
+        </w:drawing>
       </w:r>
     </w:p>
     <w:p>
@@ -14695,6 +14750,62 @@
     </w:p>
     <w:p>
       <w:pPr>
+        <w:keepNext/>
+        <w:spacing w:before="120" w:after="40"/>
+        <w:jc w:val="center"/>
+      </w:pPr>
+      <w:r>
+        <w:rPr>
+          <w:rFonts w:ascii="Times New Roman" w:hAnsi="Times New Roman" w:eastAsia="Batang"/>
+          <w:b/>
+          <w:sz w:val="18"/>
+        </w:rPr>
+        <w:t>[그림 3] OWASP Top 10 기준 탐지 범위 분포</w:t>
+      </w:r>
+    </w:p>
+    <w:p>
+      <w:pPr>
+        <w:keepLines/>
+        <w:spacing w:before="0" w:after="120"/>
+        <w:jc w:val="center"/>
+      </w:pPr>
+      <w:r>
+        <w:drawing>
+          <wp:inline xmlns:a="http://schemas.openxmlformats.org/drawingml/2006/main" xmlns:pic="http://schemas.openxmlformats.org/drawingml/2006/picture">
+            <wp:extent cx="4937760" cy="2934031"/>
+            <wp:docPr id="3" name="Picture 3" title="[그림 3] OWASP Top 10 기준 탐지 범위 분포" descr="Detection scope distribution by Both, STRIDE only, ZAP only, unmapped, and none"/>
+            <wp:cNvGraphicFramePr>
+              <a:graphicFrameLocks noChangeAspect="1"/>
+            </wp:cNvGraphicFramePr>
+            <a:graphic>
+              <a:graphicData uri="http://schemas.openxmlformats.org/drawingml/2006/picture">
+                <pic:pic>
+                  <pic:nvPicPr>
+                    <pic:cNvPr id="0" name="image.png"/>
+                    <pic:cNvPicPr/>
+                  </pic:nvPicPr>
+                  <pic:blipFill>
+                    <a:blip r:embed="rId24"/>
+                    <a:stretch>
+                      <a:fillRect/>
+                    </a:stretch>
+                  </pic:blipFill>
+                  <pic:spPr>
+                    <a:xfrm>
+                      <a:off x="0" y="0"/>
+                      <a:ext cx="4937760" cy="2934031"/>
+                    </a:xfrm>
+                    <a:prstGeom prst="rect"/>
+                  </pic:spPr>
+                </pic:pic>
+              </a:graphicData>
+            </a:graphic>
+          </wp:inline>
+        </w:drawing>
+      </w:r>
+    </w:p>
+    <w:p>
+      <w:pPr>
         <w:spacing w:after="60"/>
         <w:rPr>
           <w:lang w:eastAsia="ko-KR"/>
@@ -23513,6 +23624,18 @@
       </w:r>
     </w:p>
     <w:p>
+      <w:pPr/>
+      <w:r>
+        <w:t>본 연구의 확장 실험으로는 Jitsi Meet뿐 아니라 Mediasoup와 같은 WebRTC SFU 미디어 서버를 대상으로 삼을 수 있다. Mediasoup는 WebRTC와 RTP 기반 미디어 처리를 제공하지만 signaling protocol을 강제하지 않기 때문에, 회의방 인증, 권한 검증, WebRTC transport 상태, TURN relay 정책, audit log를 연구자가 직접 모델링하기에 적합하다[9][10].</w:t>
+      </w:r>
+    </w:p>
+    <w:p>
+      <w:pPr/>
+      <w:r>
+        <w:t>또한 n8n과 같은 workflow automation 도구를 보안 이벤트 수집 계층으로 도입하면 ZAP 재스캔 결과, WebRTC transport anomaly, 회의방 접근 이벤트, 취약 dependency advisory를 webhook으로 수집하고 위험도를 점수화할 수 있다. 다만 n8n 자체도 최근 원격 코드 실행, 파일 읽기, XSS 관련 보안 권고가 다수 공개된 실행 플랫폼이므로, self-hosted 환경에서는 최신 버전 고정, workflow 편집 권한 제한, 고위험 노드 제외, TLS reverse proxy, execution data 보관 제한을 함께 적용해야 한다[11][12].</w:t>
+      </w:r>
+    </w:p>
+    <w:p>
       <w:pPr>
         <w:spacing w:after="60"/>
       </w:pPr>
@@ -23626,6 +23749,30 @@
           <w:t>https://jitsi.github.io/handbook/</w:t>
         </w:r>
       </w:hyperlink>
+    </w:p>
+    <w:p>
+      <w:pPr/>
+      <w:r>
+        <w:t>[9] Mediasoup, Mediasoup Documentation, (2026). Available from: &lt;https://mediasoup.org/documentation/overview/&gt;</w:t>
+      </w:r>
+    </w:p>
+    <w:p>
+      <w:pPr/>
+      <w:r>
+        <w:t>[10] Versatica, mediasoup GitHub repository, (2026). Available from: &lt;https://github.com/versatica/mediasoup&gt;</w:t>
+      </w:r>
+    </w:p>
+    <w:p>
+      <w:pPr/>
+      <w:r>
+        <w:t>[11] n8n, n8n GitHub repository, (2026). Available from: &lt;https://github.com/n8n-io/n8n&gt;</w:t>
+      </w:r>
+    </w:p>
+    <w:p>
+      <w:pPr/>
+      <w:r>
+        <w:t>[12] n8n, Security advisories and self-hosted security documentation, (2026). Available from: &lt;https://github.com/n8n-io/n8n/security&gt;; &lt;https://docs.n8n.io/privacy-security/what-you-can-do/&gt;</w:t>
+      </w:r>
     </w:p>
     <w:p>
       <w:pPr>

</xml_diff>